<commit_message>
Update survey with 6 service lines from updated questions.docx
Made-with: Cursor
</commit_message>
<xml_diff>
--- a/input/questions.docx
+++ b/input/questions.docx
@@ -89,25 +89,7 @@
           <w:sz w:val="20"/>
           <w:szCs w:val="20"/>
         </w:rPr>
-        <w:t xml:space="preserve">, your input is critical to help us improve our services and measure our impact </w:t>
-      </w:r>
-      <w:proofErr w:type="gramStart"/>
-      <w:r>
-        <w:rPr>
-          <w:rFonts w:ascii="Times New Roman" w:hAnsi="Times New Roman" w:cs="Times New Roman"/>
-          <w:sz w:val="20"/>
-          <w:szCs w:val="20"/>
-        </w:rPr>
-        <w:t>to</w:t>
-      </w:r>
-      <w:proofErr w:type="gramEnd"/>
-      <w:r>
-        <w:rPr>
-          <w:rFonts w:ascii="Times New Roman" w:hAnsi="Times New Roman" w:cs="Times New Roman"/>
-          <w:sz w:val="20"/>
-          <w:szCs w:val="20"/>
-        </w:rPr>
-        <w:t xml:space="preserve"> you.</w:t>
+        <w:t>, your input is critical to help us improve our services and measure our impact to you.</w:t>
       </w:r>
     </w:p>
     <w:p>
@@ -323,12 +305,6 @@
     </w:p>
     <w:p>
       <w:pPr>
-        <w:pStyle w:val="ListParagraph"/>
-        <w:numPr>
-          <w:ilvl w:val="0"/>
-          <w:numId w:val="5"/>
-        </w:numPr>
-        <w:spacing w:after="0"/>
         <w:rPr>
           <w:rFonts w:ascii="Times New Roman" w:hAnsi="Times New Roman" w:cs="Times New Roman"/>
           <w:bCs/>
@@ -343,37 +319,18 @@
           <w:sz w:val="20"/>
           <w:szCs w:val="20"/>
         </w:rPr>
-        <w:t xml:space="preserve">Strategic Sourcing: </w:t>
+        <w:t>Strategic Sourcing: Supports supplier selection, contract negotiations, renewals, and competitive bidding to help you achieve optimal value</w:t>
       </w:r>
-      <w:r>
+    </w:p>
+    <w:p>
+      <w:pPr>
         <w:rPr>
           <w:rFonts w:ascii="Times New Roman" w:hAnsi="Times New Roman" w:cs="Times New Roman"/>
           <w:bCs/>
-          <w:i/>
-          <w:iCs/>
           <w:sz w:val="20"/>
           <w:szCs w:val="20"/>
         </w:rPr>
-        <w:t>Supports contract negotiations, renewals, supplier selection, and bidding processes to help you get the best value</w:t>
-      </w:r>
-    </w:p>
-    <w:p>
-      <w:pPr>
-        <w:pStyle w:val="ListParagraph"/>
-        <w:numPr>
-          <w:ilvl w:val="0"/>
-          <w:numId w:val="5"/>
-        </w:numPr>
-        <w:rPr>
-          <w:rFonts w:ascii="Times New Roman" w:hAnsi="Times New Roman" w:cs="Times New Roman"/>
-          <w:bCs/>
-          <w:i/>
-          <w:iCs/>
-          <w:sz w:val="20"/>
-          <w:szCs w:val="20"/>
-        </w:rPr>
-      </w:pPr>
-      <w:proofErr w:type="spellStart"/>
+      </w:pPr>
       <w:r>
         <w:rPr>
           <w:rFonts w:ascii="Times New Roman" w:hAnsi="Times New Roman" w:cs="Times New Roman"/>
@@ -381,9 +338,18 @@
           <w:sz w:val="20"/>
           <w:szCs w:val="20"/>
         </w:rPr>
-        <w:t>EP&amp;P</w:t>
+        <w:t>Buy Desk (for markets with purchase orders): Provides purchase order support, requisition processing, and transactional buying assistance to enable efficient procurement execution</w:t>
       </w:r>
-      <w:proofErr w:type="spellEnd"/>
+    </w:p>
+    <w:p>
+      <w:pPr>
+        <w:rPr>
+          <w:rFonts w:ascii="Times New Roman" w:hAnsi="Times New Roman" w:cs="Times New Roman"/>
+          <w:bCs/>
+          <w:sz w:val="20"/>
+          <w:szCs w:val="20"/>
+        </w:rPr>
+      </w:pPr>
       <w:r>
         <w:rPr>
           <w:rFonts w:ascii="Times New Roman" w:hAnsi="Times New Roman" w:cs="Times New Roman"/>
@@ -391,33 +357,14 @@
           <w:sz w:val="20"/>
           <w:szCs w:val="20"/>
         </w:rPr>
-        <w:t xml:space="preserve"> Operations: </w:t>
+        <w:t>Contract Administration: Manages contract creation, review, storage, and compliance to ensure agreements are accurate and accessible</w:t>
       </w:r>
-      <w:r>
+    </w:p>
+    <w:p>
+      <w:pPr>
         <w:rPr>
           <w:rFonts w:ascii="Times New Roman" w:hAnsi="Times New Roman" w:cs="Times New Roman"/>
           <w:bCs/>
-          <w:i/>
-          <w:iCs/>
-          <w:sz w:val="20"/>
-          <w:szCs w:val="20"/>
-        </w:rPr>
-        <w:t>Handles invoice processing, payments, and day-to-day procurement support (supplier management, service desk etc.) to keep operations running smoothly</w:t>
-      </w:r>
-    </w:p>
-    <w:p>
-      <w:pPr>
-        <w:pStyle w:val="ListParagraph"/>
-        <w:numPr>
-          <w:ilvl w:val="0"/>
-          <w:numId w:val="5"/>
-        </w:numPr>
-        <w:rPr>
-          <w:rFonts w:ascii="Times New Roman" w:hAnsi="Times New Roman" w:cs="Times New Roman"/>
-          <w:bCs/>
-          <w:i/>
-          <w:iCs/>
-          <w:color w:val="4F81BD" w:themeColor="accent1"/>
           <w:sz w:val="20"/>
           <w:szCs w:val="20"/>
         </w:rPr>
@@ -429,18 +376,26 @@
           <w:sz w:val="20"/>
           <w:szCs w:val="20"/>
         </w:rPr>
-        <w:t>Source to Pay excellence</w:t>
+        <w:t>Service Desk: Acts as the first point of contact for procurement-related queries, issue resolution, and general support to ensure smooth operations</w:t>
       </w:r>
+    </w:p>
+    <w:p>
+      <w:pPr>
+        <w:rPr>
+          <w:rFonts w:ascii="Times New Roman" w:hAnsi="Times New Roman" w:cs="Times New Roman"/>
+          <w:bCs/>
+          <w:sz w:val="20"/>
+          <w:szCs w:val="20"/>
+        </w:rPr>
+      </w:pPr>
       <w:r>
         <w:rPr>
           <w:rFonts w:ascii="Times New Roman" w:hAnsi="Times New Roman" w:cs="Times New Roman"/>
           <w:bCs/>
-          <w:i/>
-          <w:iCs/>
           <w:sz w:val="20"/>
           <w:szCs w:val="20"/>
         </w:rPr>
-        <w:t>: Leads Coupa rollout, system support, and continuous improvements to enhance your procurement experience</w:t>
+        <w:t>Supplier Onboarding: Facilitates supplier setup, documentation, and system enablement to ensure suppliers are ready for seamless engagement</w:t>
       </w:r>
     </w:p>
     <w:p>
@@ -451,6 +406,15 @@
           <w:szCs w:val="20"/>
         </w:rPr>
       </w:pPr>
+      <w:r>
+        <w:rPr>
+          <w:rFonts w:ascii="Times New Roman" w:hAnsi="Times New Roman" w:cs="Times New Roman"/>
+          <w:bCs/>
+          <w:sz w:val="20"/>
+          <w:szCs w:val="20"/>
+        </w:rPr>
+        <w:t>Accounts Payable: Handles invoice processing, payments, and query resolution to ensure timely and accurate supplier payments</w:t>
+      </w:r>
     </w:p>
     <w:p>
       <w:pPr>
@@ -633,23 +597,14 @@
         </w:rPr>
         <w:t xml:space="preserve">B) </w:t>
       </w:r>
-      <w:proofErr w:type="spellStart"/>
       <w:r>
         <w:rPr>
           <w:rFonts w:ascii="Times New Roman" w:hAnsi="Times New Roman" w:cs="Times New Roman"/>
+          <w:bCs/>
           <w:sz w:val="20"/>
           <w:szCs w:val="20"/>
         </w:rPr>
-        <w:t>EP&amp;P</w:t>
-      </w:r>
-      <w:proofErr w:type="spellEnd"/>
-      <w:r>
-        <w:rPr>
-          <w:rFonts w:ascii="Times New Roman" w:hAnsi="Times New Roman" w:cs="Times New Roman"/>
-          <w:sz w:val="20"/>
-          <w:szCs w:val="20"/>
-        </w:rPr>
-        <w:t xml:space="preserve"> Operations </w:t>
+        <w:t>Buy Desk</w:t>
       </w:r>
     </w:p>
     <w:p>
@@ -692,6 +647,8 @@
         <w:ind w:left="360"/>
         <w:rPr>
           <w:rFonts w:ascii="Times New Roman" w:hAnsi="Times New Roman" w:cs="Times New Roman"/>
+          <w:i/>
+          <w:iCs/>
           <w:sz w:val="20"/>
           <w:szCs w:val="20"/>
         </w:rPr>
@@ -702,7 +659,241 @@
           <w:sz w:val="20"/>
           <w:szCs w:val="20"/>
         </w:rPr>
-        <w:t>C) Source to pay excellence</w:t>
+        <w:t xml:space="preserve">C) </w:t>
+      </w:r>
+      <w:r>
+        <w:rPr>
+          <w:rFonts w:ascii="Times New Roman" w:hAnsi="Times New Roman" w:cs="Times New Roman"/>
+          <w:bCs/>
+          <w:sz w:val="20"/>
+          <w:szCs w:val="20"/>
+        </w:rPr>
+        <w:t>Contract Administration</w:t>
+      </w:r>
+      <w:r>
+        <w:rPr>
+          <w:rFonts w:ascii="Times New Roman" w:hAnsi="Times New Roman" w:cs="Times New Roman"/>
+          <w:i/>
+          <w:iCs/>
+          <w:sz w:val="20"/>
+          <w:szCs w:val="20"/>
+        </w:rPr>
+        <w:t xml:space="preserve"> </w:t>
+      </w:r>
+      <w:r>
+        <w:rPr>
+          <w:rFonts w:ascii="Times New Roman" w:hAnsi="Times New Roman" w:cs="Times New Roman"/>
+          <w:i/>
+          <w:iCs/>
+          <w:sz w:val="20"/>
+          <w:szCs w:val="20"/>
+        </w:rPr>
+        <w:t>Response options: Very Satisfied, Satisfied, Neutral, Dissatisfied, Very Dissatisfied</w:t>
+      </w:r>
+    </w:p>
+    <w:p>
+      <w:pPr>
+        <w:pStyle w:val="ListParagraph"/>
+        <w:ind w:left="360"/>
+        <w:rPr>
+          <w:rFonts w:ascii="Times New Roman" w:hAnsi="Times New Roman" w:cs="Times New Roman"/>
+          <w:sz w:val="20"/>
+          <w:szCs w:val="20"/>
+        </w:rPr>
+      </w:pPr>
+    </w:p>
+    <w:p>
+      <w:pPr>
+        <w:pStyle w:val="ListParagraph"/>
+        <w:ind w:left="360"/>
+        <w:rPr>
+          <w:rFonts w:ascii="Times New Roman" w:hAnsi="Times New Roman" w:cs="Times New Roman"/>
+          <w:i/>
+          <w:iCs/>
+          <w:sz w:val="20"/>
+          <w:szCs w:val="20"/>
+        </w:rPr>
+      </w:pPr>
+      <w:r>
+        <w:rPr>
+          <w:rFonts w:ascii="Times New Roman" w:hAnsi="Times New Roman" w:cs="Times New Roman"/>
+          <w:bCs/>
+          <w:sz w:val="20"/>
+          <w:szCs w:val="20"/>
+        </w:rPr>
+        <w:lastRenderedPageBreak/>
+        <w:t xml:space="preserve">d) </w:t>
+      </w:r>
+      <w:r>
+        <w:rPr>
+          <w:rFonts w:ascii="Times New Roman" w:hAnsi="Times New Roman" w:cs="Times New Roman"/>
+          <w:bCs/>
+          <w:sz w:val="20"/>
+          <w:szCs w:val="20"/>
+        </w:rPr>
+        <w:t>Service Desk</w:t>
+      </w:r>
+      <w:r>
+        <w:rPr>
+          <w:rFonts w:ascii="Times New Roman" w:hAnsi="Times New Roman" w:cs="Times New Roman"/>
+          <w:i/>
+          <w:iCs/>
+          <w:sz w:val="20"/>
+          <w:szCs w:val="20"/>
+        </w:rPr>
+        <w:t xml:space="preserve"> </w:t>
+      </w:r>
+    </w:p>
+    <w:p>
+      <w:pPr>
+        <w:pStyle w:val="ListParagraph"/>
+        <w:ind w:left="360"/>
+        <w:rPr>
+          <w:rFonts w:ascii="Times New Roman" w:hAnsi="Times New Roman" w:cs="Times New Roman"/>
+          <w:i/>
+          <w:iCs/>
+          <w:sz w:val="20"/>
+          <w:szCs w:val="20"/>
+        </w:rPr>
+      </w:pPr>
+      <w:r>
+        <w:rPr>
+          <w:rFonts w:ascii="Times New Roman" w:hAnsi="Times New Roman" w:cs="Times New Roman"/>
+          <w:i/>
+          <w:iCs/>
+          <w:sz w:val="20"/>
+          <w:szCs w:val="20"/>
+        </w:rPr>
+        <w:t>Response options: Very Satisfied, Satisfied, Neutral, Dissatisfied, Very Dissatisfied, N/A</w:t>
+      </w:r>
+    </w:p>
+    <w:p>
+      <w:pPr>
+        <w:pStyle w:val="ListParagraph"/>
+        <w:ind w:left="360"/>
+        <w:rPr>
+          <w:rFonts w:ascii="Times New Roman" w:hAnsi="Times New Roman" w:cs="Times New Roman"/>
+          <w:sz w:val="20"/>
+          <w:szCs w:val="20"/>
+        </w:rPr>
+      </w:pPr>
+    </w:p>
+    <w:p>
+      <w:pPr>
+        <w:pStyle w:val="ListParagraph"/>
+        <w:ind w:left="360"/>
+        <w:rPr>
+          <w:rFonts w:ascii="Times New Roman" w:hAnsi="Times New Roman" w:cs="Times New Roman"/>
+          <w:sz w:val="20"/>
+          <w:szCs w:val="20"/>
+        </w:rPr>
+      </w:pPr>
+      <w:r>
+        <w:rPr>
+          <w:rFonts w:ascii="Times New Roman" w:hAnsi="Times New Roman" w:cs="Times New Roman"/>
+          <w:sz w:val="20"/>
+          <w:szCs w:val="20"/>
+        </w:rPr>
+        <w:t>e</w:t>
+      </w:r>
+      <w:r>
+        <w:rPr>
+          <w:rFonts w:ascii="Times New Roman" w:hAnsi="Times New Roman" w:cs="Times New Roman"/>
+          <w:sz w:val="20"/>
+          <w:szCs w:val="20"/>
+        </w:rPr>
+        <w:t xml:space="preserve">) </w:t>
+      </w:r>
+      <w:r>
+        <w:rPr>
+          <w:rFonts w:ascii="Times New Roman" w:hAnsi="Times New Roman" w:cs="Times New Roman"/>
+          <w:bCs/>
+          <w:sz w:val="20"/>
+          <w:szCs w:val="20"/>
+        </w:rPr>
+        <w:t>Supplier Onboarding</w:t>
+      </w:r>
+    </w:p>
+    <w:p>
+      <w:pPr>
+        <w:pStyle w:val="ListParagraph"/>
+        <w:ind w:left="360"/>
+        <w:rPr>
+          <w:rFonts w:ascii="Times New Roman" w:hAnsi="Times New Roman" w:cs="Times New Roman"/>
+          <w:i/>
+          <w:iCs/>
+          <w:sz w:val="20"/>
+          <w:szCs w:val="20"/>
+        </w:rPr>
+      </w:pPr>
+      <w:r>
+        <w:rPr>
+          <w:rFonts w:ascii="Times New Roman" w:hAnsi="Times New Roman" w:cs="Times New Roman"/>
+          <w:i/>
+          <w:iCs/>
+          <w:sz w:val="20"/>
+          <w:szCs w:val="20"/>
+        </w:rPr>
+        <w:t>Response options: Very Satisfied, Satisfied, Neutral, Dissatisfied, Very Dissatisfied</w:t>
+      </w:r>
+    </w:p>
+    <w:p>
+      <w:pPr>
+        <w:pStyle w:val="ListParagraph"/>
+        <w:ind w:left="360"/>
+        <w:rPr>
+          <w:rFonts w:ascii="Times New Roman" w:hAnsi="Times New Roman" w:cs="Times New Roman"/>
+          <w:sz w:val="20"/>
+          <w:szCs w:val="20"/>
+        </w:rPr>
+      </w:pPr>
+    </w:p>
+    <w:p>
+      <w:pPr>
+        <w:pStyle w:val="ListParagraph"/>
+        <w:ind w:left="360"/>
+        <w:rPr>
+          <w:rFonts w:ascii="Times New Roman" w:hAnsi="Times New Roman" w:cs="Times New Roman"/>
+          <w:i/>
+          <w:iCs/>
+          <w:sz w:val="20"/>
+          <w:szCs w:val="20"/>
+        </w:rPr>
+      </w:pPr>
+      <w:r>
+        <w:rPr>
+          <w:rFonts w:ascii="Times New Roman" w:hAnsi="Times New Roman" w:cs="Times New Roman"/>
+          <w:sz w:val="20"/>
+          <w:szCs w:val="20"/>
+        </w:rPr>
+        <w:t>f</w:t>
+      </w:r>
+      <w:r>
+        <w:rPr>
+          <w:rFonts w:ascii="Times New Roman" w:hAnsi="Times New Roman" w:cs="Times New Roman"/>
+          <w:sz w:val="20"/>
+          <w:szCs w:val="20"/>
+        </w:rPr>
+        <w:t xml:space="preserve">) </w:t>
+      </w:r>
+      <w:r>
+        <w:rPr>
+          <w:rFonts w:ascii="Times New Roman" w:hAnsi="Times New Roman" w:cs="Times New Roman"/>
+          <w:bCs/>
+          <w:sz w:val="20"/>
+          <w:szCs w:val="20"/>
+        </w:rPr>
+        <w:t>Accounts Payable</w:t>
+      </w:r>
+      <w:r>
+        <w:rPr>
+          <w:rFonts w:ascii="Times New Roman" w:hAnsi="Times New Roman" w:cs="Times New Roman"/>
+          <w:i/>
+          <w:iCs/>
+          <w:sz w:val="20"/>
+          <w:szCs w:val="20"/>
+        </w:rPr>
+        <w:t xml:space="preserve"> </w:t>
       </w:r>
     </w:p>
     <w:p>
@@ -917,7 +1108,6 @@
           <w:sz w:val="20"/>
           <w:szCs w:val="20"/>
         </w:rPr>
-        <w:lastRenderedPageBreak/>
         <w:t>---------------------------------------------------------------------------------------------------------------------------</w:t>
       </w:r>
     </w:p>
@@ -970,25 +1160,7 @@
           <w:sz w:val="20"/>
           <w:szCs w:val="20"/>
         </w:rPr>
-        <w:t xml:space="preserve"> members who have gone above and beyond </w:t>
-      </w:r>
-      <w:proofErr w:type="gramStart"/>
-      <w:r>
-        <w:rPr>
-          <w:rFonts w:ascii="Times New Roman" w:hAnsi="Times New Roman" w:cs="Times New Roman"/>
-          <w:sz w:val="20"/>
-          <w:szCs w:val="20"/>
-        </w:rPr>
-        <w:t>in providing</w:t>
-      </w:r>
-      <w:proofErr w:type="gramEnd"/>
-      <w:r>
-        <w:rPr>
-          <w:rFonts w:ascii="Times New Roman" w:hAnsi="Times New Roman" w:cs="Times New Roman"/>
-          <w:sz w:val="20"/>
-          <w:szCs w:val="20"/>
-        </w:rPr>
-        <w:t xml:space="preserve"> you with exceptional service?</w:t>
+        <w:t xml:space="preserve"> members who have gone above and beyond in providing you with exceptional service?</w:t>
       </w:r>
     </w:p>
     <w:p>
@@ -1208,6 +1380,95 @@
     </w:lvl>
   </w:abstractNum>
   <w:abstractNum w:abstractNumId="9" w15:restartNumberingAfterBreak="0">
+    <w:nsid w:val="1D40635C"/>
+    <w:multiLevelType w:val="hybridMultilevel"/>
+    <w:tmpl w:val="68A85D1C"/>
+    <w:lvl w:ilvl="0" w:tplc="04090017">
+      <w:start w:val="4"/>
+      <w:numFmt w:val="lowerLetter"/>
+      <w:lvlText w:val="%1)"/>
+      <w:lvlJc w:val="left"/>
+      <w:pPr>
+        <w:ind w:left="720" w:hanging="360"/>
+      </w:pPr>
+      <w:rPr>
+        <w:rFonts w:hint="default"/>
+      </w:rPr>
+    </w:lvl>
+    <w:lvl w:ilvl="1" w:tplc="04090019" w:tentative="1">
+      <w:start w:val="1"/>
+      <w:numFmt w:val="lowerLetter"/>
+      <w:lvlText w:val="%2."/>
+      <w:lvlJc w:val="left"/>
+      <w:pPr>
+        <w:ind w:left="1440" w:hanging="360"/>
+      </w:pPr>
+    </w:lvl>
+    <w:lvl w:ilvl="2" w:tplc="0409001B" w:tentative="1">
+      <w:start w:val="1"/>
+      <w:numFmt w:val="lowerRoman"/>
+      <w:lvlText w:val="%3."/>
+      <w:lvlJc w:val="right"/>
+      <w:pPr>
+        <w:ind w:left="2160" w:hanging="180"/>
+      </w:pPr>
+    </w:lvl>
+    <w:lvl w:ilvl="3" w:tplc="0409000F" w:tentative="1">
+      <w:start w:val="1"/>
+      <w:numFmt w:val="decimal"/>
+      <w:lvlText w:val="%4."/>
+      <w:lvlJc w:val="left"/>
+      <w:pPr>
+        <w:ind w:left="2880" w:hanging="360"/>
+      </w:pPr>
+    </w:lvl>
+    <w:lvl w:ilvl="4" w:tplc="04090019" w:tentative="1">
+      <w:start w:val="1"/>
+      <w:numFmt w:val="lowerLetter"/>
+      <w:lvlText w:val="%5."/>
+      <w:lvlJc w:val="left"/>
+      <w:pPr>
+        <w:ind w:left="3600" w:hanging="360"/>
+      </w:pPr>
+    </w:lvl>
+    <w:lvl w:ilvl="5" w:tplc="0409001B" w:tentative="1">
+      <w:start w:val="1"/>
+      <w:numFmt w:val="lowerRoman"/>
+      <w:lvlText w:val="%6."/>
+      <w:lvlJc w:val="right"/>
+      <w:pPr>
+        <w:ind w:left="4320" w:hanging="180"/>
+      </w:pPr>
+    </w:lvl>
+    <w:lvl w:ilvl="6" w:tplc="0409000F" w:tentative="1">
+      <w:start w:val="1"/>
+      <w:numFmt w:val="decimal"/>
+      <w:lvlText w:val="%7."/>
+      <w:lvlJc w:val="left"/>
+      <w:pPr>
+        <w:ind w:left="5040" w:hanging="360"/>
+      </w:pPr>
+    </w:lvl>
+    <w:lvl w:ilvl="7" w:tplc="04090019" w:tentative="1">
+      <w:start w:val="1"/>
+      <w:numFmt w:val="lowerLetter"/>
+      <w:lvlText w:val="%8."/>
+      <w:lvlJc w:val="left"/>
+      <w:pPr>
+        <w:ind w:left="5760" w:hanging="360"/>
+      </w:pPr>
+    </w:lvl>
+    <w:lvl w:ilvl="8" w:tplc="0409001B" w:tentative="1">
+      <w:start w:val="1"/>
+      <w:numFmt w:val="lowerRoman"/>
+      <w:lvlText w:val="%9."/>
+      <w:lvlJc w:val="right"/>
+      <w:pPr>
+        <w:ind w:left="6480" w:hanging="180"/>
+      </w:pPr>
+    </w:lvl>
+  </w:abstractNum>
+  <w:abstractNum w:abstractNumId="10" w15:restartNumberingAfterBreak="0">
     <w:nsid w:val="5A677447"/>
     <w:multiLevelType w:val="hybridMultilevel"/>
     <w:tmpl w:val="052CA738"/>
@@ -1296,7 +1557,7 @@
       </w:pPr>
     </w:lvl>
   </w:abstractNum>
-  <w:abstractNum w:abstractNumId="10" w15:restartNumberingAfterBreak="0">
+  <w:abstractNum w:abstractNumId="11" w15:restartNumberingAfterBreak="0">
     <w:nsid w:val="762076B4"/>
     <w:multiLevelType w:val="hybridMultilevel"/>
     <w:tmpl w:val="43E4D318"/>
@@ -1385,7 +1646,7 @@
       </w:pPr>
     </w:lvl>
   </w:abstractNum>
-  <w:abstractNum w:abstractNumId="11" w15:restartNumberingAfterBreak="0">
+  <w:abstractNum w:abstractNumId="12" w15:restartNumberingAfterBreak="0">
     <w:nsid w:val="78DE2784"/>
     <w:multiLevelType w:val="hybridMultilevel"/>
     <w:tmpl w:val="1090E636"/>
@@ -1474,7 +1735,7 @@
       </w:pPr>
     </w:lvl>
   </w:abstractNum>
-  <w:abstractNum w:abstractNumId="12" w15:restartNumberingAfterBreak="0">
+  <w:abstractNum w:abstractNumId="13" w15:restartNumberingAfterBreak="0">
     <w:nsid w:val="7BCD3ED8"/>
     <w:multiLevelType w:val="hybridMultilevel"/>
     <w:tmpl w:val="899CB738"/>
@@ -1567,7 +1828,7 @@
     <w:abstractNumId w:val="5"/>
   </w:num>
   <w:num w:numId="2" w16cid:durableId="1581330670">
-    <w:abstractNumId w:val="12"/>
+    <w:abstractNumId w:val="13"/>
   </w:num>
   <w:num w:numId="3" w16cid:durableId="1632248029">
     <w:abstractNumId w:val="7"/>
@@ -1576,7 +1837,7 @@
     <w:abstractNumId w:val="1"/>
   </w:num>
   <w:num w:numId="5" w16cid:durableId="212619977">
-    <w:abstractNumId w:val="10"/>
+    <w:abstractNumId w:val="11"/>
   </w:num>
   <w:num w:numId="6" w16cid:durableId="2142189618">
     <w:abstractNumId w:val="6"/>
@@ -1597,10 +1858,13 @@
     <w:abstractNumId w:val="3"/>
   </w:num>
   <w:num w:numId="12" w16cid:durableId="87236442">
-    <w:abstractNumId w:val="9"/>
+    <w:abstractNumId w:val="10"/>
   </w:num>
   <w:num w:numId="13" w16cid:durableId="1833450396">
-    <w:abstractNumId w:val="11"/>
+    <w:abstractNumId w:val="12"/>
+  </w:num>
+  <w:num w:numId="14" w16cid:durableId="505822466">
+    <w:abstractNumId w:val="9"/>
   </w:num>
 </w:numbering>
 </file>
@@ -2208,7 +2472,6 @@
   <w:style w:type="character" w:default="1" w:styleId="DefaultParagraphFont">
     <w:name w:val="Default Paragraph Font"/>
     <w:uiPriority w:val="1"/>
-    <w:semiHidden/>
     <w:unhideWhenUsed/>
   </w:style>
   <w:style w:type="table" w:default="1" w:styleId="TableNormal">
@@ -13309,6 +13572,28 @@
 </file>
 
 <file path=customXml/item1.xml><?xml version="1.0" encoding="utf-8"?>
+<?mso-contentType ?>
+<FormTemplates xmlns="http://schemas.microsoft.com/sharepoint/v3/contenttype/forms">
+  <Display>DocumentLibraryForm</Display>
+  <Edit>DocumentLibraryForm</Edit>
+  <New>DocumentLibraryForm</New>
+</FormTemplates>
+</file>
+
+<file path=customXml/item2.xml><?xml version="1.0" encoding="utf-8"?>
+<p:properties xmlns:p="http://schemas.microsoft.com/office/2006/metadata/properties" xmlns:xsi="http://www.w3.org/2001/XMLSchema-instance" xmlns:pc="http://schemas.microsoft.com/office/infopath/2007/PartnerControls">
+  <documentManagement>
+    <_ip_UnifiedCompliancePolicyUIAction xmlns="http://schemas.microsoft.com/sharepoint/v3" xsi:nil="true"/>
+    <TaxCatchAll xmlns="b5c13724-4b6e-48d8-86ac-faa37dbd06cd" xsi:nil="true"/>
+    <_ip_UnifiedCompliancePolicyProperties xmlns="http://schemas.microsoft.com/sharepoint/v3" xsi:nil="true"/>
+    <lcf76f155ced4ddcb4097134ff3c332f xmlns="928e58be-b327-421c-aecc-2802004af528">
+      <Terms xmlns="http://schemas.microsoft.com/office/infopath/2007/PartnerControls"/>
+    </lcf76f155ced4ddcb4097134ff3c332f>
+  </documentManagement>
+</p:properties>
+</file>
+
+<file path=customXml/item3.xml><?xml version="1.0" encoding="utf-8"?>
 <ct:contentTypeSchema xmlns:ct="http://schemas.microsoft.com/office/2006/metadata/contentType" xmlns:ma="http://schemas.microsoft.com/office/2006/metadata/properties/metaAttributes" ct:_="" ma:_="" ma:contentTypeName="Document" ma:contentTypeID="0x010100FABCA9418F571448982B350B78F65879" ma:contentTypeVersion="18" ma:contentTypeDescription="Create a new document." ma:contentTypeScope="" ma:versionID="3980d677b8545a1a20619f8e1650ff54">
   <xsd:schema xmlns:xsd="http://www.w3.org/2001/XMLSchema" xmlns:xs="http://www.w3.org/2001/XMLSchema" xmlns:p="http://schemas.microsoft.com/office/2006/metadata/properties" xmlns:ns1="http://schemas.microsoft.com/sharepoint/v3" xmlns:ns2="b5c13724-4b6e-48d8-86ac-faa37dbd06cd" xmlns:ns3="928e58be-b327-421c-aecc-2802004af528" targetNamespace="http://schemas.microsoft.com/office/2006/metadata/properties" ma:root="true" ma:fieldsID="200a570977902ba77426f11f4cc9efff" ns1:_="" ns2:_="" ns3:_="">
     <xsd:import namespace="http://schemas.microsoft.com/sharepoint/v3"/>
@@ -13566,29 +13851,27 @@
 </ct:contentTypeSchema>
 </file>
 
-<file path=customXml/item2.xml><?xml version="1.0" encoding="utf-8"?>
-<p:properties xmlns:p="http://schemas.microsoft.com/office/2006/metadata/properties" xmlns:xsi="http://www.w3.org/2001/XMLSchema-instance" xmlns:pc="http://schemas.microsoft.com/office/infopath/2007/PartnerControls">
-  <documentManagement>
-    <_ip_UnifiedCompliancePolicyUIAction xmlns="http://schemas.microsoft.com/sharepoint/v3" xsi:nil="true"/>
-    <TaxCatchAll xmlns="b5c13724-4b6e-48d8-86ac-faa37dbd06cd" xsi:nil="true"/>
-    <_ip_UnifiedCompliancePolicyProperties xmlns="http://schemas.microsoft.com/sharepoint/v3" xsi:nil="true"/>
-    <lcf76f155ced4ddcb4097134ff3c332f xmlns="928e58be-b327-421c-aecc-2802004af528">
-      <Terms xmlns="http://schemas.microsoft.com/office/infopath/2007/PartnerControls"/>
-    </lcf76f155ced4ddcb4097134ff3c332f>
-  </documentManagement>
-</p:properties>
+<file path=customXml/itemProps1.xml><?xml version="1.0" encoding="utf-8"?>
+<ds:datastoreItem xmlns:ds="http://schemas.openxmlformats.org/officeDocument/2006/customXml" ds:itemID="{1A4D9557-E16A-42D8-938B-3AD9C0A33A41}">
+  <ds:schemaRefs>
+    <ds:schemaRef ds:uri="http://schemas.microsoft.com/sharepoint/v3/contenttype/forms"/>
+  </ds:schemaRefs>
+</ds:datastoreItem>
 </file>
 
-<file path=customXml/item3.xml><?xml version="1.0" encoding="utf-8"?>
-<?mso-contentType ?>
-<FormTemplates xmlns="http://schemas.microsoft.com/sharepoint/v3/contenttype/forms">
-  <Display>DocumentLibraryForm</Display>
-  <Edit>DocumentLibraryForm</Edit>
-  <New>DocumentLibraryForm</New>
-</FormTemplates>
+<file path=customXml/itemProps2.xml><?xml version="1.0" encoding="utf-8"?>
+<ds:datastoreItem xmlns:ds="http://schemas.openxmlformats.org/officeDocument/2006/customXml" ds:itemID="{68B78899-D595-4C32-BD52-A7A5AE7E3E18}">
+  <ds:schemaRefs>
+    <ds:schemaRef ds:uri="http://schemas.microsoft.com/office/2006/metadata/properties"/>
+    <ds:schemaRef ds:uri="http://schemas.microsoft.com/office/infopath/2007/PartnerControls"/>
+    <ds:schemaRef ds:uri="http://schemas.microsoft.com/sharepoint/v3"/>
+    <ds:schemaRef ds:uri="b5c13724-4b6e-48d8-86ac-faa37dbd06cd"/>
+    <ds:schemaRef ds:uri="928e58be-b327-421c-aecc-2802004af528"/>
+  </ds:schemaRefs>
+</ds:datastoreItem>
 </file>
 
-<file path=customXml/itemProps1.xml><?xml version="1.0" encoding="utf-8"?>
+<file path=customXml/itemProps3.xml><?xml version="1.0" encoding="utf-8"?>
 <ds:datastoreItem xmlns:ds="http://schemas.openxmlformats.org/officeDocument/2006/customXml" ds:itemID="{1B89B707-313B-475C-83F2-7FBF8189BDEB}">
   <ds:schemaRefs>
     <ds:schemaRef ds:uri="http://schemas.microsoft.com/office/2006/metadata/contentType"/>
@@ -13606,24 +13889,4 @@
     <ds:schemaRef ds:uri="http://schemas.microsoft.com/internal/obd"/>
   </ds:schemaRefs>
 </ds:datastoreItem>
-</file>
-
-<file path=customXml/itemProps2.xml><?xml version="1.0" encoding="utf-8"?>
-<ds:datastoreItem xmlns:ds="http://schemas.openxmlformats.org/officeDocument/2006/customXml" ds:itemID="{68B78899-D595-4C32-BD52-A7A5AE7E3E18}">
-  <ds:schemaRefs>
-    <ds:schemaRef ds:uri="http://schemas.microsoft.com/office/2006/metadata/properties"/>
-    <ds:schemaRef ds:uri="http://schemas.microsoft.com/office/infopath/2007/PartnerControls"/>
-    <ds:schemaRef ds:uri="http://schemas.microsoft.com/sharepoint/v3"/>
-    <ds:schemaRef ds:uri="b5c13724-4b6e-48d8-86ac-faa37dbd06cd"/>
-    <ds:schemaRef ds:uri="928e58be-b327-421c-aecc-2802004af528"/>
-  </ds:schemaRefs>
-</ds:datastoreItem>
-</file>
-
-<file path=customXml/itemProps3.xml><?xml version="1.0" encoding="utf-8"?>
-<ds:datastoreItem xmlns:ds="http://schemas.openxmlformats.org/officeDocument/2006/customXml" ds:itemID="{1A4D9557-E16A-42D8-938B-3AD9C0A33A41}">
-  <ds:schemaRefs>
-    <ds:schemaRef ds:uri="http://schemas.microsoft.com/sharepoint/v3/contenttype/forms"/>
-  </ds:schemaRefs>
-</ds:datastoreItem>
 </file>
</xml_diff>

<commit_message>
Update survey for GCH region - standalone HTML
</commit_message>
<xml_diff>
--- a/input/questions.docx
+++ b/input/questions.docx
@@ -4,8 +4,10 @@
   <w:body>
     <w:p>
       <w:pPr>
+        <w:spacing w:beforeLines="80" w:before="192" w:afterLines="80" w:after="192" w:line="264" w:lineRule="auto"/>
         <w:rPr>
           <w:rFonts w:ascii="Times New Roman" w:hAnsi="Times New Roman" w:cs="Times New Roman"/>
+          <w:b/>
           <w:sz w:val="20"/>
           <w:szCs w:val="20"/>
         </w:rPr>
@@ -28,31 +30,86 @@
           <w:sz w:val="20"/>
           <w:szCs w:val="20"/>
         </w:rPr>
-        <w:t xml:space="preserve"> Questionnaire</w:t>
+        <w:t xml:space="preserve"> </w:t>
+      </w:r>
+      <w:proofErr w:type="spellStart"/>
+      <w:r>
+        <w:rPr>
+          <w:rFonts w:ascii="Times New Roman" w:hAnsi="Times New Roman" w:cs="Times New Roman"/>
+          <w:b/>
+          <w:sz w:val="20"/>
+          <w:szCs w:val="20"/>
+        </w:rPr>
+        <w:t>GCH</w:t>
+      </w:r>
+      <w:proofErr w:type="spellEnd"/>
+      <w:r>
+        <w:rPr>
+          <w:rFonts w:ascii="Times New Roman" w:hAnsi="Times New Roman" w:cs="Times New Roman"/>
+          <w:b/>
+          <w:sz w:val="20"/>
+          <w:szCs w:val="20"/>
+        </w:rPr>
+        <w:t xml:space="preserve"> region Questionnaire </w:t>
       </w:r>
     </w:p>
     <w:p>
       <w:pPr>
+        <w:spacing w:beforeLines="80" w:before="192" w:afterLines="80" w:after="192" w:line="264" w:lineRule="auto"/>
         <w:rPr>
           <w:rFonts w:ascii="Times New Roman" w:hAnsi="Times New Roman" w:cs="Times New Roman"/>
+          <w:b/>
           <w:sz w:val="20"/>
           <w:szCs w:val="20"/>
         </w:rPr>
       </w:pPr>
+    </w:p>
+    <w:p>
+      <w:pPr>
+        <w:spacing w:beforeLines="80" w:before="192" w:afterLines="80" w:after="192" w:line="264" w:lineRule="auto"/>
+        <w:rPr>
+          <w:rFonts w:ascii="Times New Roman" w:hAnsi="Times New Roman" w:cs="Times New Roman"/>
+          <w:b/>
+          <w:sz w:val="20"/>
+          <w:szCs w:val="20"/>
+        </w:rPr>
+      </w:pPr>
       <w:r>
         <w:rPr>
           <w:rFonts w:ascii="Times New Roman" w:hAnsi="Times New Roman" w:cs="Times New Roman"/>
+          <w:b/>
           <w:sz w:val="20"/>
           <w:szCs w:val="20"/>
         </w:rPr>
-        <w:t>Page 1:</w:t>
+        <w:t>Page:1</w:t>
       </w:r>
     </w:p>
     <w:p>
       <w:pPr>
-        <w:spacing w:after="0"/>
+        <w:spacing w:beforeLines="80" w:before="192" w:afterLines="80" w:after="192" w:line="264" w:lineRule="auto"/>
         <w:rPr>
           <w:rFonts w:ascii="Times New Roman" w:hAnsi="Times New Roman" w:cs="Times New Roman"/>
+          <w:b/>
+          <w:sz w:val="20"/>
+          <w:szCs w:val="20"/>
+        </w:rPr>
+      </w:pPr>
+      <w:r>
+        <w:rPr>
+          <w:rFonts w:ascii="Times New Roman" w:hAnsi="Times New Roman" w:cs="Times New Roman"/>
+          <w:b/>
+          <w:sz w:val="20"/>
+          <w:szCs w:val="20"/>
+        </w:rPr>
+        <w:t>Introduction:</w:t>
+      </w:r>
+    </w:p>
+    <w:p>
+      <w:pPr>
+        <w:spacing w:beforeLines="80" w:before="192" w:afterLines="80" w:after="192" w:line="264" w:lineRule="auto"/>
+        <w:rPr>
+          <w:rFonts w:ascii="Times New Roman" w:hAnsi="Times New Roman" w:cs="Times New Roman"/>
+          <w:b/>
           <w:sz w:val="20"/>
           <w:szCs w:val="20"/>
         </w:rPr>
@@ -81,33 +138,7 @@
           <w:sz w:val="20"/>
           <w:szCs w:val="20"/>
         </w:rPr>
-        <w:t xml:space="preserve"> team</w:t>
-      </w:r>
-      <w:r>
-        <w:rPr>
-          <w:rFonts w:ascii="Times New Roman" w:hAnsi="Times New Roman" w:cs="Times New Roman"/>
-          <w:sz w:val="20"/>
-          <w:szCs w:val="20"/>
-        </w:rPr>
-        <w:t>, your input is critical to help us improve our services and measure our impact to you.</w:t>
-      </w:r>
-    </w:p>
-    <w:p>
-      <w:pPr>
-        <w:spacing w:after="0"/>
-        <w:rPr>
-          <w:rFonts w:ascii="Times New Roman" w:hAnsi="Times New Roman" w:cs="Times New Roman"/>
-          <w:sz w:val="20"/>
-          <w:szCs w:val="20"/>
-        </w:rPr>
-      </w:pPr>
-      <w:r>
-        <w:rPr>
-          <w:rFonts w:ascii="Times New Roman" w:hAnsi="Times New Roman" w:cs="Times New Roman"/>
-          <w:sz w:val="20"/>
-          <w:szCs w:val="20"/>
-        </w:rPr>
-        <w:t xml:space="preserve">Please take two minutes to complete this </w:t>
+        <w:t xml:space="preserve"> </w:t>
       </w:r>
       <w:proofErr w:type="spellStart"/>
       <w:r>
@@ -116,7 +147,7 @@
           <w:sz w:val="20"/>
           <w:szCs w:val="20"/>
         </w:rPr>
-        <w:t>CSAT</w:t>
+        <w:t>GCH</w:t>
       </w:r>
       <w:proofErr w:type="spellEnd"/>
       <w:r>
@@ -125,31 +156,43 @@
           <w:sz w:val="20"/>
           <w:szCs w:val="20"/>
         </w:rPr>
-        <w:t xml:space="preserve"> survey and share your feedback by </w:t>
+        <w:t xml:space="preserve"> region, your input is critical to help us improve our services and measure our impact </w:t>
       </w:r>
+      <w:proofErr w:type="gramStart"/>
       <w:r>
         <w:rPr>
           <w:rFonts w:ascii="Times New Roman" w:hAnsi="Times New Roman" w:cs="Times New Roman"/>
           <w:sz w:val="20"/>
           <w:szCs w:val="20"/>
         </w:rPr>
-        <w:t>May</w:t>
+        <w:t>to</w:t>
       </w:r>
+      <w:proofErr w:type="gramEnd"/>
       <w:r>
         <w:rPr>
           <w:rFonts w:ascii="Times New Roman" w:hAnsi="Times New Roman" w:cs="Times New Roman"/>
           <w:sz w:val="20"/>
           <w:szCs w:val="20"/>
         </w:rPr>
-        <w:t xml:space="preserve"> </w:t>
+        <w:t xml:space="preserve"> you.</w:t>
       </w:r>
+    </w:p>
+    <w:p>
+      <w:pPr>
+        <w:spacing w:beforeLines="80" w:before="192" w:afterLines="80" w:after="192" w:line="264" w:lineRule="auto"/>
+        <w:rPr>
+          <w:rFonts w:ascii="Times New Roman" w:hAnsi="Times New Roman" w:cs="Times New Roman"/>
+          <w:sz w:val="20"/>
+          <w:szCs w:val="20"/>
+        </w:rPr>
+      </w:pPr>
       <w:r>
         <w:rPr>
           <w:rFonts w:ascii="Times New Roman" w:hAnsi="Times New Roman" w:cs="Times New Roman"/>
           <w:sz w:val="20"/>
           <w:szCs w:val="20"/>
         </w:rPr>
-        <w:t>1</w:t>
+        <w:t>Please take two minutes to complete this CSAT survey and share your feedback by October 15</w:t>
       </w:r>
       <w:r>
         <w:rPr>
@@ -158,7 +201,7 @@
           <w:szCs w:val="20"/>
           <w:vertAlign w:val="superscript"/>
         </w:rPr>
-        <w:t>st</w:t>
+        <w:t>th</w:t>
       </w:r>
       <w:r>
         <w:rPr>
@@ -171,10 +214,13 @@
     </w:p>
     <w:p>
       <w:pPr>
+        <w:spacing w:beforeLines="80" w:before="192" w:afterLines="80" w:after="192" w:line="264" w:lineRule="auto"/>
         <w:rPr>
           <w:rFonts w:ascii="Times New Roman" w:hAnsi="Times New Roman" w:cs="Times New Roman"/>
-          <w:sz w:val="20"/>
-          <w:szCs w:val="20"/>
+          <w:i/>
+          <w:iCs/>
+          <w:sz w:val="16"/>
+          <w:szCs w:val="16"/>
         </w:rPr>
       </w:pPr>
       <w:r>
@@ -185,9 +231,28 @@
         </w:rPr>
         <w:t>Please enter your email.</w:t>
       </w:r>
+      <w:r>
+        <w:rPr>
+          <w:rFonts w:ascii="Times New Roman" w:hAnsi="Times New Roman" w:cs="Times New Roman"/>
+          <w:sz w:val="20"/>
+          <w:szCs w:val="20"/>
+        </w:rPr>
+        <w:br/>
+      </w:r>
+      <w:r>
+        <w:rPr>
+          <w:rFonts w:ascii="Times New Roman" w:hAnsi="Times New Roman" w:cs="Times New Roman"/>
+          <w:i/>
+          <w:iCs/>
+          <w:sz w:val="16"/>
+          <w:szCs w:val="16"/>
+        </w:rPr>
+        <w:t>Space for text</w:t>
+      </w:r>
     </w:p>
     <w:p>
       <w:pPr>
+        <w:spacing w:beforeLines="80" w:before="192" w:afterLines="80" w:after="192" w:line="264" w:lineRule="auto"/>
         <w:rPr>
           <w:rFonts w:ascii="Times New Roman" w:hAnsi="Times New Roman" w:cs="Times New Roman"/>
           <w:b/>
@@ -198,6 +263,7 @@
     </w:p>
     <w:p>
       <w:pPr>
+        <w:spacing w:beforeLines="80" w:before="192" w:afterLines="80" w:after="192" w:line="264" w:lineRule="auto"/>
         <w:rPr>
           <w:rFonts w:ascii="Times New Roman" w:hAnsi="Times New Roman" w:cs="Times New Roman"/>
           <w:b/>
@@ -212,11 +278,12 @@
           <w:sz w:val="20"/>
           <w:szCs w:val="20"/>
         </w:rPr>
-        <w:t>---------------------------------------------------------------------------------------------------------------------------------</w:t>
+        <w:t>--------------------------------------------------------------------------------------------------------------------------------</w:t>
       </w:r>
     </w:p>
     <w:p>
       <w:pPr>
+        <w:spacing w:beforeLines="80" w:before="192" w:afterLines="80" w:after="192" w:line="264" w:lineRule="auto"/>
         <w:rPr>
           <w:rFonts w:ascii="Times New Roman" w:hAnsi="Times New Roman" w:cs="Times New Roman"/>
           <w:b/>
@@ -227,9 +294,10 @@
     </w:p>
     <w:p>
       <w:pPr>
+        <w:spacing w:beforeLines="80" w:before="192" w:afterLines="80" w:after="192" w:line="264" w:lineRule="auto"/>
         <w:rPr>
           <w:rFonts w:ascii="Times New Roman" w:hAnsi="Times New Roman" w:cs="Times New Roman"/>
-          <w:bCs/>
+          <w:b/>
           <w:sz w:val="20"/>
           <w:szCs w:val="20"/>
         </w:rPr>
@@ -237,18 +305,19 @@
       <w:r>
         <w:rPr>
           <w:rFonts w:ascii="Times New Roman" w:hAnsi="Times New Roman" w:cs="Times New Roman"/>
-          <w:bCs/>
+          <w:b/>
           <w:sz w:val="20"/>
           <w:szCs w:val="20"/>
         </w:rPr>
-        <w:t>Page 2:</w:t>
+        <w:t>Page2:</w:t>
       </w:r>
     </w:p>
     <w:p>
       <w:pPr>
+        <w:spacing w:beforeLines="80" w:before="192" w:afterLines="80" w:after="192" w:line="264" w:lineRule="auto"/>
         <w:rPr>
           <w:rFonts w:ascii="Times New Roman" w:hAnsi="Times New Roman" w:cs="Times New Roman"/>
-          <w:bCs/>
+          <w:b/>
           <w:sz w:val="20"/>
           <w:szCs w:val="20"/>
         </w:rPr>
@@ -285,7 +354,12 @@
     </w:p>
     <w:p>
       <w:pPr>
-        <w:spacing w:after="0"/>
+        <w:pStyle w:val="ListParagraph"/>
+        <w:numPr>
+          <w:ilvl w:val="0"/>
+          <w:numId w:val="5"/>
+        </w:numPr>
+        <w:spacing w:beforeLines="80" w:before="192" w:afterLines="80" w:after="192" w:line="264" w:lineRule="auto"/>
         <w:rPr>
           <w:rFonts w:ascii="Times New Roman" w:hAnsi="Times New Roman" w:cs="Times New Roman"/>
           <w:bCs/>
@@ -300,11 +374,17 @@
           <w:sz w:val="20"/>
           <w:szCs w:val="20"/>
         </w:rPr>
-        <w:t>Response options:</w:t>
+        <w:t>Supplier Onboarding</w:t>
       </w:r>
     </w:p>
     <w:p>
       <w:pPr>
+        <w:pStyle w:val="ListParagraph"/>
+        <w:numPr>
+          <w:ilvl w:val="0"/>
+          <w:numId w:val="5"/>
+        </w:numPr>
+        <w:spacing w:beforeLines="80" w:before="192" w:afterLines="80" w:after="192" w:line="264" w:lineRule="auto"/>
         <w:rPr>
           <w:rFonts w:ascii="Times New Roman" w:hAnsi="Times New Roman" w:cs="Times New Roman"/>
           <w:bCs/>
@@ -319,11 +399,17 @@
           <w:sz w:val="20"/>
           <w:szCs w:val="20"/>
         </w:rPr>
-        <w:t>Strategic Sourcing: Supports supplier selection, contract negotiations, renewals, and competitive bidding to help you achieve optimal value</w:t>
+        <w:t>Service Desk</w:t>
       </w:r>
     </w:p>
     <w:p>
       <w:pPr>
+        <w:pStyle w:val="ListParagraph"/>
+        <w:numPr>
+          <w:ilvl w:val="0"/>
+          <w:numId w:val="5"/>
+        </w:numPr>
+        <w:spacing w:beforeLines="80" w:before="192" w:afterLines="80" w:after="192" w:line="264" w:lineRule="auto"/>
         <w:rPr>
           <w:rFonts w:ascii="Times New Roman" w:hAnsi="Times New Roman" w:cs="Times New Roman"/>
           <w:bCs/>
@@ -338,11 +424,17 @@
           <w:sz w:val="20"/>
           <w:szCs w:val="20"/>
         </w:rPr>
-        <w:t>Buy Desk (for markets with purchase orders): Provides purchase order support, requisition processing, and transactional buying assistance to enable efficient procurement execution</w:t>
+        <w:t>Accounts Payable</w:t>
       </w:r>
     </w:p>
     <w:p>
       <w:pPr>
+        <w:pStyle w:val="ListParagraph"/>
+        <w:numPr>
+          <w:ilvl w:val="0"/>
+          <w:numId w:val="5"/>
+        </w:numPr>
+        <w:spacing w:beforeLines="80" w:before="192" w:afterLines="80" w:after="192" w:line="264" w:lineRule="auto"/>
         <w:rPr>
           <w:rFonts w:ascii="Times New Roman" w:hAnsi="Times New Roman" w:cs="Times New Roman"/>
           <w:bCs/>
@@ -357,11 +449,17 @@
           <w:sz w:val="20"/>
           <w:szCs w:val="20"/>
         </w:rPr>
-        <w:t>Contract Administration: Manages contract creation, review, storage, and compliance to ensure agreements are accurate and accessible</w:t>
+        <w:t>Buy Desk</w:t>
       </w:r>
     </w:p>
     <w:p>
       <w:pPr>
+        <w:pStyle w:val="ListParagraph"/>
+        <w:numPr>
+          <w:ilvl w:val="0"/>
+          <w:numId w:val="5"/>
+        </w:numPr>
+        <w:spacing w:beforeLines="80" w:before="192" w:afterLines="80" w:after="192" w:line="264" w:lineRule="auto"/>
         <w:rPr>
           <w:rFonts w:ascii="Times New Roman" w:hAnsi="Times New Roman" w:cs="Times New Roman"/>
           <w:bCs/>
@@ -376,11 +474,17 @@
           <w:sz w:val="20"/>
           <w:szCs w:val="20"/>
         </w:rPr>
-        <w:t>Service Desk: Acts as the first point of contact for procurement-related queries, issue resolution, and general support to ensure smooth operations</w:t>
+        <w:t>Sourcing</w:t>
       </w:r>
     </w:p>
     <w:p>
       <w:pPr>
+        <w:pStyle w:val="ListParagraph"/>
+        <w:numPr>
+          <w:ilvl w:val="0"/>
+          <w:numId w:val="5"/>
+        </w:numPr>
+        <w:spacing w:beforeLines="80" w:before="192" w:afterLines="80" w:after="192" w:line="264" w:lineRule="auto"/>
         <w:rPr>
           <w:rFonts w:ascii="Times New Roman" w:hAnsi="Times New Roman" w:cs="Times New Roman"/>
           <w:bCs/>
@@ -395,29 +499,43 @@
           <w:sz w:val="20"/>
           <w:szCs w:val="20"/>
         </w:rPr>
-        <w:t>Supplier Onboarding: Facilitates supplier setup, documentation, and system enablement to ensure suppliers are ready for seamless engagement</w:t>
+        <w:t>Risk Screening</w:t>
       </w:r>
     </w:p>
     <w:p>
       <w:pPr>
-        <w:rPr>
-          <w:rFonts w:ascii="Times New Roman" w:hAnsi="Times New Roman" w:cs="Times New Roman"/>
-          <w:sz w:val="20"/>
-          <w:szCs w:val="20"/>
-        </w:rPr>
-      </w:pPr>
-      <w:r>
+        <w:spacing w:beforeLines="80" w:before="192" w:afterLines="80" w:after="192" w:line="264" w:lineRule="auto"/>
         <w:rPr>
           <w:rFonts w:ascii="Times New Roman" w:hAnsi="Times New Roman" w:cs="Times New Roman"/>
           <w:bCs/>
           <w:sz w:val="20"/>
           <w:szCs w:val="20"/>
         </w:rPr>
-        <w:t>Accounts Payable: Handles invoice processing, payments, and query resolution to ensure timely and accurate supplier payments</w:t>
+      </w:pPr>
+    </w:p>
+    <w:p>
+      <w:pPr>
+        <w:spacing w:beforeLines="80" w:before="192" w:afterLines="80" w:after="192" w:line="264" w:lineRule="auto"/>
+        <w:rPr>
+          <w:rFonts w:ascii="Times New Roman" w:hAnsi="Times New Roman" w:cs="Times New Roman"/>
+          <w:b/>
+          <w:sz w:val="20"/>
+          <w:szCs w:val="20"/>
+        </w:rPr>
+      </w:pPr>
+      <w:r>
+        <w:rPr>
+          <w:rFonts w:ascii="Times New Roman" w:hAnsi="Times New Roman" w:cs="Times New Roman"/>
+          <w:b/>
+          <w:sz w:val="20"/>
+          <w:szCs w:val="20"/>
+        </w:rPr>
+        <w:t>---------------------------------------------------------------------------------------------------------------------------------</w:t>
       </w:r>
     </w:p>
     <w:p>
       <w:pPr>
+        <w:spacing w:beforeLines="80" w:before="192" w:afterLines="80" w:after="192" w:line="264" w:lineRule="auto"/>
         <w:rPr>
           <w:rFonts w:ascii="Times New Roman" w:hAnsi="Times New Roman" w:cs="Times New Roman"/>
           <w:b/>
@@ -434,40 +552,7 @@
           <w:sz w:val="20"/>
           <w:szCs w:val="20"/>
         </w:rPr>
-        <w:t>--------------------------------------------------------------------------------------------------------------------------------</w:t>
-      </w:r>
-    </w:p>
-    <w:p>
-      <w:pPr>
-        <w:rPr>
-          <w:rFonts w:ascii="Times New Roman" w:hAnsi="Times New Roman" w:cs="Times New Roman"/>
-          <w:sz w:val="20"/>
-          <w:szCs w:val="20"/>
-        </w:rPr>
-      </w:pPr>
-      <w:r>
-        <w:rPr>
-          <w:rFonts w:ascii="Times New Roman" w:hAnsi="Times New Roman" w:cs="Times New Roman"/>
-          <w:sz w:val="20"/>
-          <w:szCs w:val="20"/>
-        </w:rPr>
-        <w:t xml:space="preserve">Page </w:t>
-      </w:r>
-      <w:r>
-        <w:rPr>
-          <w:rFonts w:ascii="Times New Roman" w:hAnsi="Times New Roman" w:cs="Times New Roman"/>
-          <w:sz w:val="20"/>
-          <w:szCs w:val="20"/>
-        </w:rPr>
-        <w:t>3</w:t>
-      </w:r>
-      <w:r>
-        <w:rPr>
-          <w:rFonts w:ascii="Times New Roman" w:hAnsi="Times New Roman" w:cs="Times New Roman"/>
-          <w:sz w:val="20"/>
-          <w:szCs w:val="20"/>
-        </w:rPr>
-        <w:t>:</w:t>
+        <w:t>Page 3:</w:t>
       </w:r>
     </w:p>
     <w:p>
@@ -477,6 +562,7 @@
           <w:ilvl w:val="0"/>
           <w:numId w:val="12"/>
         </w:numPr>
+        <w:spacing w:beforeLines="80" w:before="192" w:afterLines="80" w:after="192" w:line="264" w:lineRule="auto"/>
         <w:ind w:left="360"/>
         <w:rPr>
           <w:rFonts w:ascii="Times New Roman" w:hAnsi="Times New Roman" w:cs="Times New Roman"/>
@@ -508,46 +594,13 @@
           <w:sz w:val="20"/>
           <w:szCs w:val="20"/>
         </w:rPr>
-        <w:t xml:space="preserve"> team </w:t>
-      </w:r>
-      <w:r>
-        <w:rPr>
-          <w:rFonts w:ascii="Times New Roman" w:hAnsi="Times New Roman" w:cs="Times New Roman"/>
-          <w:sz w:val="20"/>
-          <w:szCs w:val="20"/>
-        </w:rPr>
-        <w:t>in your market?</w:t>
+        <w:t xml:space="preserve"> team in your market?</w:t>
       </w:r>
     </w:p>
     <w:p>
       <w:pPr>
         <w:pStyle w:val="ListParagraph"/>
-        <w:numPr>
-          <w:ilvl w:val="0"/>
-          <w:numId w:val="13"/>
-        </w:numPr>
-        <w:rPr>
-          <w:rFonts w:ascii="Times New Roman" w:hAnsi="Times New Roman" w:cs="Times New Roman"/>
-          <w:i/>
-          <w:iCs/>
-          <w:sz w:val="20"/>
-          <w:szCs w:val="20"/>
-        </w:rPr>
-      </w:pPr>
-      <w:r>
-        <w:rPr>
-          <w:rFonts w:ascii="Times New Roman" w:hAnsi="Times New Roman" w:cs="Times New Roman"/>
-          <w:i/>
-          <w:iCs/>
-          <w:sz w:val="20"/>
-          <w:szCs w:val="20"/>
-        </w:rPr>
-        <w:t xml:space="preserve">Strategic sourcing </w:t>
-      </w:r>
-    </w:p>
-    <w:p>
-      <w:pPr>
-        <w:pStyle w:val="ListParagraph"/>
+        <w:spacing w:beforeLines="80" w:before="192" w:afterLines="80" w:after="192" w:line="264" w:lineRule="auto"/>
         <w:ind w:left="360"/>
         <w:rPr>
           <w:rFonts w:ascii="Times New Roman" w:hAnsi="Times New Roman" w:cs="Times New Roman"/>
@@ -571,6 +624,7 @@
     <w:p>
       <w:pPr>
         <w:pStyle w:val="ListParagraph"/>
+        <w:spacing w:beforeLines="80" w:before="192" w:afterLines="80" w:after="192" w:line="264" w:lineRule="auto"/>
         <w:ind w:left="360"/>
         <w:rPr>
           <w:rFonts w:ascii="Times New Roman" w:hAnsi="Times New Roman" w:cs="Times New Roman"/>
@@ -582,6 +636,7 @@
     <w:p>
       <w:pPr>
         <w:pStyle w:val="ListParagraph"/>
+        <w:spacing w:beforeLines="80" w:before="192" w:afterLines="80" w:after="192" w:line="264" w:lineRule="auto"/>
         <w:ind w:left="360"/>
         <w:rPr>
           <w:rFonts w:ascii="Times New Roman" w:hAnsi="Times New Roman" w:cs="Times New Roman"/>
@@ -595,21 +650,71 @@
           <w:sz w:val="20"/>
           <w:szCs w:val="20"/>
         </w:rPr>
-        <w:t xml:space="preserve">B) </w:t>
+        <w:t xml:space="preserve">If satisfied, what worked well. </w:t>
       </w:r>
+    </w:p>
+    <w:p>
+      <w:pPr>
+        <w:pStyle w:val="ListParagraph"/>
+        <w:spacing w:beforeLines="80" w:before="192" w:afterLines="80" w:after="192" w:line="264" w:lineRule="auto"/>
+        <w:ind w:left="360"/>
+        <w:rPr>
+          <w:rFonts w:ascii="Times New Roman" w:hAnsi="Times New Roman" w:cs="Times New Roman"/>
+          <w:i/>
+          <w:iCs/>
+          <w:sz w:val="16"/>
+          <w:szCs w:val="16"/>
+        </w:rPr>
+      </w:pPr>
       <w:r>
         <w:rPr>
           <w:rFonts w:ascii="Times New Roman" w:hAnsi="Times New Roman" w:cs="Times New Roman"/>
-          <w:bCs/>
+          <w:i/>
+          <w:iCs/>
+          <w:sz w:val="16"/>
+          <w:szCs w:val="16"/>
+        </w:rPr>
+        <w:t>Space for text</w:t>
+      </w:r>
+    </w:p>
+    <w:p>
+      <w:pPr>
+        <w:pStyle w:val="ListParagraph"/>
+        <w:spacing w:beforeLines="80" w:before="192" w:afterLines="80" w:after="192" w:line="264" w:lineRule="auto"/>
+        <w:ind w:left="360"/>
+        <w:rPr>
+          <w:rFonts w:ascii="Times New Roman" w:hAnsi="Times New Roman" w:cs="Times New Roman"/>
+          <w:i/>
+          <w:iCs/>
+          <w:sz w:val="16"/>
+          <w:szCs w:val="16"/>
+        </w:rPr>
+      </w:pPr>
+    </w:p>
+    <w:p>
+      <w:pPr>
+        <w:pStyle w:val="ListParagraph"/>
+        <w:spacing w:beforeLines="80" w:before="192" w:afterLines="80" w:after="192" w:line="264" w:lineRule="auto"/>
+        <w:ind w:left="360"/>
+        <w:rPr>
+          <w:rFonts w:ascii="Times New Roman" w:hAnsi="Times New Roman" w:cs="Times New Roman"/>
           <w:sz w:val="20"/>
           <w:szCs w:val="20"/>
         </w:rPr>
-        <w:t>Buy Desk</w:t>
+      </w:pPr>
+      <w:r>
+        <w:rPr>
+          <w:rFonts w:ascii="Times New Roman" w:hAnsi="Times New Roman" w:cs="Times New Roman"/>
+          <w:sz w:val="20"/>
+          <w:szCs w:val="20"/>
+        </w:rPr>
+        <w:t xml:space="preserve">If dissatisfied, what could be improved. </w:t>
       </w:r>
     </w:p>
     <w:p>
       <w:pPr>
         <w:pStyle w:val="ListParagraph"/>
+        <w:spacing w:beforeLines="80" w:before="192" w:afterLines="80" w:after="192" w:line="264" w:lineRule="auto"/>
         <w:ind w:left="360"/>
         <w:rPr>
           <w:rFonts w:ascii="Times New Roman" w:hAnsi="Times New Roman" w:cs="Times New Roman"/>
@@ -624,15 +729,16 @@
           <w:rFonts w:ascii="Times New Roman" w:hAnsi="Times New Roman" w:cs="Times New Roman"/>
           <w:i/>
           <w:iCs/>
-          <w:sz w:val="20"/>
-          <w:szCs w:val="20"/>
+          <w:sz w:val="16"/>
+          <w:szCs w:val="16"/>
         </w:rPr>
-        <w:t>Response options: Very Satisfied, Satisfied, Neutral, Dissatisfied, Very Dissatisfied</w:t>
+        <w:t>Space for text</w:t>
       </w:r>
     </w:p>
     <w:p>
       <w:pPr>
         <w:pStyle w:val="ListParagraph"/>
+        <w:spacing w:beforeLines="80" w:before="192" w:afterLines="80" w:after="192" w:line="264" w:lineRule="auto"/>
         <w:ind w:left="360"/>
         <w:rPr>
           <w:rFonts w:ascii="Times New Roman" w:hAnsi="Times New Roman" w:cs="Times New Roman"/>
@@ -644,11 +750,14 @@
     <w:p>
       <w:pPr>
         <w:pStyle w:val="ListParagraph"/>
+        <w:numPr>
+          <w:ilvl w:val="0"/>
+          <w:numId w:val="12"/>
+        </w:numPr>
+        <w:spacing w:beforeLines="80" w:before="192" w:afterLines="80" w:after="192" w:line="264" w:lineRule="auto"/>
         <w:ind w:left="360"/>
         <w:rPr>
           <w:rFonts w:ascii="Times New Roman" w:hAnsi="Times New Roman" w:cs="Times New Roman"/>
-          <w:i/>
-          <w:iCs/>
           <w:sz w:val="20"/>
           <w:szCs w:val="20"/>
         </w:rPr>
@@ -659,412 +768,13 @@
           <w:sz w:val="20"/>
           <w:szCs w:val="20"/>
         </w:rPr>
-        <w:t xml:space="preserve">C) </w:t>
-      </w:r>
-      <w:r>
-        <w:rPr>
-          <w:rFonts w:ascii="Times New Roman" w:hAnsi="Times New Roman" w:cs="Times New Roman"/>
-          <w:bCs/>
-          <w:sz w:val="20"/>
-          <w:szCs w:val="20"/>
-        </w:rPr>
-        <w:t>Contract Administration</w:t>
-      </w:r>
-      <w:r>
-        <w:rPr>
-          <w:rFonts w:ascii="Times New Roman" w:hAnsi="Times New Roman" w:cs="Times New Roman"/>
-          <w:i/>
-          <w:iCs/>
-          <w:sz w:val="20"/>
-          <w:szCs w:val="20"/>
-        </w:rPr>
-        <w:t xml:space="preserve"> </w:t>
-      </w:r>
-      <w:r>
-        <w:rPr>
-          <w:rFonts w:ascii="Times New Roman" w:hAnsi="Times New Roman" w:cs="Times New Roman"/>
-          <w:i/>
-          <w:iCs/>
-          <w:sz w:val="20"/>
-          <w:szCs w:val="20"/>
-        </w:rPr>
-        <w:t>Response options: Very Satisfied, Satisfied, Neutral, Dissatisfied, Very Dissatisfied</w:t>
+        <w:t>Placeholder question:</w:t>
       </w:r>
     </w:p>
     <w:p>
       <w:pPr>
         <w:pStyle w:val="ListParagraph"/>
-        <w:ind w:left="360"/>
-        <w:rPr>
-          <w:rFonts w:ascii="Times New Roman" w:hAnsi="Times New Roman" w:cs="Times New Roman"/>
-          <w:sz w:val="20"/>
-          <w:szCs w:val="20"/>
-        </w:rPr>
-      </w:pPr>
-    </w:p>
-    <w:p>
-      <w:pPr>
-        <w:pStyle w:val="ListParagraph"/>
-        <w:ind w:left="360"/>
-        <w:rPr>
-          <w:rFonts w:ascii="Times New Roman" w:hAnsi="Times New Roman" w:cs="Times New Roman"/>
-          <w:i/>
-          <w:iCs/>
-          <w:sz w:val="20"/>
-          <w:szCs w:val="20"/>
-        </w:rPr>
-      </w:pPr>
-      <w:r>
-        <w:rPr>
-          <w:rFonts w:ascii="Times New Roman" w:hAnsi="Times New Roman" w:cs="Times New Roman"/>
-          <w:bCs/>
-          <w:sz w:val="20"/>
-          <w:szCs w:val="20"/>
-        </w:rPr>
-        <w:lastRenderedPageBreak/>
-        <w:t xml:space="preserve">d) </w:t>
-      </w:r>
-      <w:r>
-        <w:rPr>
-          <w:rFonts w:ascii="Times New Roman" w:hAnsi="Times New Roman" w:cs="Times New Roman"/>
-          <w:bCs/>
-          <w:sz w:val="20"/>
-          <w:szCs w:val="20"/>
-        </w:rPr>
-        <w:t>Service Desk</w:t>
-      </w:r>
-      <w:r>
-        <w:rPr>
-          <w:rFonts w:ascii="Times New Roman" w:hAnsi="Times New Roman" w:cs="Times New Roman"/>
-          <w:i/>
-          <w:iCs/>
-          <w:sz w:val="20"/>
-          <w:szCs w:val="20"/>
-        </w:rPr>
-        <w:t xml:space="preserve"> </w:t>
-      </w:r>
-    </w:p>
-    <w:p>
-      <w:pPr>
-        <w:pStyle w:val="ListParagraph"/>
-        <w:ind w:left="360"/>
-        <w:rPr>
-          <w:rFonts w:ascii="Times New Roman" w:hAnsi="Times New Roman" w:cs="Times New Roman"/>
-          <w:i/>
-          <w:iCs/>
-          <w:sz w:val="20"/>
-          <w:szCs w:val="20"/>
-        </w:rPr>
-      </w:pPr>
-      <w:r>
-        <w:rPr>
-          <w:rFonts w:ascii="Times New Roman" w:hAnsi="Times New Roman" w:cs="Times New Roman"/>
-          <w:i/>
-          <w:iCs/>
-          <w:sz w:val="20"/>
-          <w:szCs w:val="20"/>
-        </w:rPr>
-        <w:t>Response options: Very Satisfied, Satisfied, Neutral, Dissatisfied, Very Dissatisfied, N/A</w:t>
-      </w:r>
-    </w:p>
-    <w:p>
-      <w:pPr>
-        <w:pStyle w:val="ListParagraph"/>
-        <w:ind w:left="360"/>
-        <w:rPr>
-          <w:rFonts w:ascii="Times New Roman" w:hAnsi="Times New Roman" w:cs="Times New Roman"/>
-          <w:sz w:val="20"/>
-          <w:szCs w:val="20"/>
-        </w:rPr>
-      </w:pPr>
-    </w:p>
-    <w:p>
-      <w:pPr>
-        <w:pStyle w:val="ListParagraph"/>
-        <w:ind w:left="360"/>
-        <w:rPr>
-          <w:rFonts w:ascii="Times New Roman" w:hAnsi="Times New Roman" w:cs="Times New Roman"/>
-          <w:sz w:val="20"/>
-          <w:szCs w:val="20"/>
-        </w:rPr>
-      </w:pPr>
-      <w:r>
-        <w:rPr>
-          <w:rFonts w:ascii="Times New Roman" w:hAnsi="Times New Roman" w:cs="Times New Roman"/>
-          <w:sz w:val="20"/>
-          <w:szCs w:val="20"/>
-        </w:rPr>
-        <w:t>e</w:t>
-      </w:r>
-      <w:r>
-        <w:rPr>
-          <w:rFonts w:ascii="Times New Roman" w:hAnsi="Times New Roman" w:cs="Times New Roman"/>
-          <w:sz w:val="20"/>
-          <w:szCs w:val="20"/>
-        </w:rPr>
-        <w:t xml:space="preserve">) </w:t>
-      </w:r>
-      <w:r>
-        <w:rPr>
-          <w:rFonts w:ascii="Times New Roman" w:hAnsi="Times New Roman" w:cs="Times New Roman"/>
-          <w:bCs/>
-          <w:sz w:val="20"/>
-          <w:szCs w:val="20"/>
-        </w:rPr>
-        <w:t>Supplier Onboarding</w:t>
-      </w:r>
-    </w:p>
-    <w:p>
-      <w:pPr>
-        <w:pStyle w:val="ListParagraph"/>
-        <w:ind w:left="360"/>
-        <w:rPr>
-          <w:rFonts w:ascii="Times New Roman" w:hAnsi="Times New Roman" w:cs="Times New Roman"/>
-          <w:i/>
-          <w:iCs/>
-          <w:sz w:val="20"/>
-          <w:szCs w:val="20"/>
-        </w:rPr>
-      </w:pPr>
-      <w:r>
-        <w:rPr>
-          <w:rFonts w:ascii="Times New Roman" w:hAnsi="Times New Roman" w:cs="Times New Roman"/>
-          <w:i/>
-          <w:iCs/>
-          <w:sz w:val="20"/>
-          <w:szCs w:val="20"/>
-        </w:rPr>
-        <w:t>Response options: Very Satisfied, Satisfied, Neutral, Dissatisfied, Very Dissatisfied</w:t>
-      </w:r>
-    </w:p>
-    <w:p>
-      <w:pPr>
-        <w:pStyle w:val="ListParagraph"/>
-        <w:ind w:left="360"/>
-        <w:rPr>
-          <w:rFonts w:ascii="Times New Roman" w:hAnsi="Times New Roman" w:cs="Times New Roman"/>
-          <w:sz w:val="20"/>
-          <w:szCs w:val="20"/>
-        </w:rPr>
-      </w:pPr>
-    </w:p>
-    <w:p>
-      <w:pPr>
-        <w:pStyle w:val="ListParagraph"/>
-        <w:ind w:left="360"/>
-        <w:rPr>
-          <w:rFonts w:ascii="Times New Roman" w:hAnsi="Times New Roman" w:cs="Times New Roman"/>
-          <w:i/>
-          <w:iCs/>
-          <w:sz w:val="20"/>
-          <w:szCs w:val="20"/>
-        </w:rPr>
-      </w:pPr>
-      <w:r>
-        <w:rPr>
-          <w:rFonts w:ascii="Times New Roman" w:hAnsi="Times New Roman" w:cs="Times New Roman"/>
-          <w:sz w:val="20"/>
-          <w:szCs w:val="20"/>
-        </w:rPr>
-        <w:t>f</w:t>
-      </w:r>
-      <w:r>
-        <w:rPr>
-          <w:rFonts w:ascii="Times New Roman" w:hAnsi="Times New Roman" w:cs="Times New Roman"/>
-          <w:sz w:val="20"/>
-          <w:szCs w:val="20"/>
-        </w:rPr>
-        <w:t xml:space="preserve">) </w:t>
-      </w:r>
-      <w:r>
-        <w:rPr>
-          <w:rFonts w:ascii="Times New Roman" w:hAnsi="Times New Roman" w:cs="Times New Roman"/>
-          <w:bCs/>
-          <w:sz w:val="20"/>
-          <w:szCs w:val="20"/>
-        </w:rPr>
-        <w:t>Accounts Payable</w:t>
-      </w:r>
-      <w:r>
-        <w:rPr>
-          <w:rFonts w:ascii="Times New Roman" w:hAnsi="Times New Roman" w:cs="Times New Roman"/>
-          <w:i/>
-          <w:iCs/>
-          <w:sz w:val="20"/>
-          <w:szCs w:val="20"/>
-        </w:rPr>
-        <w:t xml:space="preserve"> </w:t>
-      </w:r>
-    </w:p>
-    <w:p>
-      <w:pPr>
-        <w:pStyle w:val="ListParagraph"/>
-        <w:ind w:left="360"/>
-        <w:rPr>
-          <w:rFonts w:ascii="Times New Roman" w:hAnsi="Times New Roman" w:cs="Times New Roman"/>
-          <w:i/>
-          <w:iCs/>
-          <w:sz w:val="20"/>
-          <w:szCs w:val="20"/>
-        </w:rPr>
-      </w:pPr>
-      <w:r>
-        <w:rPr>
-          <w:rFonts w:ascii="Times New Roman" w:hAnsi="Times New Roman" w:cs="Times New Roman"/>
-          <w:i/>
-          <w:iCs/>
-          <w:sz w:val="20"/>
-          <w:szCs w:val="20"/>
-        </w:rPr>
-        <w:t>Response options: Very Satisfied, Satisfied, Neutral, Dissatisfied, Very Dissatisfied</w:t>
-      </w:r>
-    </w:p>
-    <w:p>
-      <w:pPr>
-        <w:pStyle w:val="ListParagraph"/>
-        <w:ind w:left="360"/>
-        <w:rPr>
-          <w:rFonts w:ascii="Times New Roman" w:hAnsi="Times New Roman" w:cs="Times New Roman"/>
-          <w:sz w:val="20"/>
-          <w:szCs w:val="20"/>
-        </w:rPr>
-      </w:pPr>
-    </w:p>
-    <w:p>
-      <w:pPr>
-        <w:pStyle w:val="ListParagraph"/>
-        <w:numPr>
-          <w:ilvl w:val="0"/>
-          <w:numId w:val="12"/>
-        </w:numPr>
-        <w:ind w:left="360"/>
-        <w:rPr>
-          <w:rFonts w:ascii="Times New Roman" w:hAnsi="Times New Roman" w:cs="Times New Roman"/>
-          <w:sz w:val="20"/>
-          <w:szCs w:val="20"/>
-        </w:rPr>
-      </w:pPr>
-      <w:r>
-        <w:rPr>
-          <w:rFonts w:ascii="Times New Roman" w:hAnsi="Times New Roman" w:cs="Times New Roman"/>
-          <w:sz w:val="20"/>
-          <w:szCs w:val="20"/>
-        </w:rPr>
-        <w:t xml:space="preserve">Overall, how satisfied are you with the service provided by the </w:t>
-      </w:r>
-      <w:proofErr w:type="spellStart"/>
-      <w:r>
-        <w:rPr>
-          <w:rFonts w:ascii="Times New Roman" w:hAnsi="Times New Roman" w:cs="Times New Roman"/>
-          <w:sz w:val="20"/>
-          <w:szCs w:val="20"/>
-        </w:rPr>
-        <w:t>EP&amp;P</w:t>
-      </w:r>
-      <w:proofErr w:type="spellEnd"/>
-      <w:r>
-        <w:rPr>
-          <w:rFonts w:ascii="Times New Roman" w:hAnsi="Times New Roman" w:cs="Times New Roman"/>
-          <w:sz w:val="20"/>
-          <w:szCs w:val="20"/>
-        </w:rPr>
-        <w:t xml:space="preserve"> t</w:t>
-      </w:r>
-      <w:r>
-        <w:rPr>
-          <w:rFonts w:ascii="Times New Roman" w:hAnsi="Times New Roman" w:cs="Times New Roman"/>
-          <w:sz w:val="20"/>
-          <w:szCs w:val="20"/>
-        </w:rPr>
-        <w:t>eam in your market?</w:t>
-      </w:r>
-    </w:p>
-    <w:p>
-      <w:pPr>
-        <w:pStyle w:val="ListParagraph"/>
-        <w:ind w:left="360"/>
-        <w:rPr>
-          <w:rFonts w:ascii="Times New Roman" w:hAnsi="Times New Roman" w:cs="Times New Roman"/>
-          <w:i/>
-          <w:iCs/>
-          <w:sz w:val="20"/>
-          <w:szCs w:val="20"/>
-        </w:rPr>
-      </w:pPr>
-      <w:r>
-        <w:rPr>
-          <w:rFonts w:ascii="Times New Roman" w:hAnsi="Times New Roman" w:cs="Times New Roman"/>
-          <w:i/>
-          <w:iCs/>
-          <w:sz w:val="20"/>
-          <w:szCs w:val="20"/>
-        </w:rPr>
-        <w:t>Response options: Very Satisfied, Satisfied, Neutral, Dissatisfied, Very Dissatisfied</w:t>
-      </w:r>
-    </w:p>
-    <w:p>
-      <w:pPr>
-        <w:pStyle w:val="ListParagraph"/>
-        <w:ind w:left="360"/>
-        <w:rPr>
-          <w:rFonts w:ascii="Times New Roman" w:hAnsi="Times New Roman" w:cs="Times New Roman"/>
-          <w:sz w:val="20"/>
-          <w:szCs w:val="20"/>
-        </w:rPr>
-      </w:pPr>
-    </w:p>
-    <w:p>
-      <w:pPr>
-        <w:pStyle w:val="ListParagraph"/>
-        <w:numPr>
-          <w:ilvl w:val="0"/>
-          <w:numId w:val="12"/>
-        </w:numPr>
-        <w:ind w:left="360"/>
-        <w:rPr>
-          <w:rFonts w:ascii="Times New Roman" w:hAnsi="Times New Roman" w:cs="Times New Roman"/>
-          <w:sz w:val="20"/>
-          <w:szCs w:val="20"/>
-        </w:rPr>
-      </w:pPr>
-      <w:r>
-        <w:rPr>
-          <w:rFonts w:ascii="Times New Roman" w:hAnsi="Times New Roman" w:cs="Times New Roman"/>
-          <w:sz w:val="20"/>
-          <w:szCs w:val="20"/>
-        </w:rPr>
-        <w:t xml:space="preserve">How can our </w:t>
-      </w:r>
-      <w:proofErr w:type="spellStart"/>
-      <w:r>
-        <w:rPr>
-          <w:rFonts w:ascii="Times New Roman" w:hAnsi="Times New Roman" w:cs="Times New Roman"/>
-          <w:sz w:val="20"/>
-          <w:szCs w:val="20"/>
-        </w:rPr>
-        <w:t>EP&amp;P</w:t>
-      </w:r>
-      <w:proofErr w:type="spellEnd"/>
-      <w:r>
-        <w:rPr>
-          <w:rFonts w:ascii="Times New Roman" w:hAnsi="Times New Roman" w:cs="Times New Roman"/>
-          <w:sz w:val="20"/>
-          <w:szCs w:val="20"/>
-        </w:rPr>
-        <w:t xml:space="preserve"> </w:t>
-      </w:r>
-      <w:r>
-        <w:rPr>
-          <w:rFonts w:ascii="Times New Roman" w:hAnsi="Times New Roman" w:cs="Times New Roman"/>
-          <w:sz w:val="20"/>
-          <w:szCs w:val="20"/>
-        </w:rPr>
-        <w:t>team improve services provided to you?</w:t>
-      </w:r>
-    </w:p>
-    <w:p>
-      <w:pPr>
-        <w:pStyle w:val="ListParagraph"/>
+        <w:spacing w:beforeLines="80" w:before="192" w:afterLines="80" w:after="192" w:line="264" w:lineRule="auto"/>
         <w:ind w:left="360"/>
         <w:rPr>
           <w:rFonts w:ascii="Times New Roman" w:hAnsi="Times New Roman" w:cs="Times New Roman"/>
@@ -1087,8 +797,13 @@
     </w:p>
     <w:p>
       <w:pPr>
+        <w:pStyle w:val="ListParagraph"/>
+        <w:spacing w:beforeLines="80" w:before="192" w:afterLines="80" w:after="192" w:line="264" w:lineRule="auto"/>
+        <w:ind w:left="360"/>
         <w:rPr>
           <w:rFonts w:ascii="Times New Roman" w:hAnsi="Times New Roman" w:cs="Times New Roman"/>
+          <w:i/>
+          <w:iCs/>
           <w:sz w:val="20"/>
           <w:szCs w:val="20"/>
         </w:rPr>
@@ -1096,6 +811,13 @@
     </w:p>
     <w:p>
       <w:pPr>
+        <w:pStyle w:val="ListParagraph"/>
+        <w:numPr>
+          <w:ilvl w:val="0"/>
+          <w:numId w:val="12"/>
+        </w:numPr>
+        <w:spacing w:beforeLines="80" w:before="192" w:afterLines="80" w:after="192" w:line="264" w:lineRule="auto"/>
+        <w:ind w:left="360"/>
         <w:rPr>
           <w:rFonts w:ascii="Times New Roman" w:hAnsi="Times New Roman" w:cs="Times New Roman"/>
           <w:sz w:val="20"/>
@@ -1108,11 +830,55 @@
           <w:sz w:val="20"/>
           <w:szCs w:val="20"/>
         </w:rPr>
+        <w:t>Placeholder question:</w:t>
+      </w:r>
+    </w:p>
+    <w:p>
+      <w:pPr>
+        <w:pStyle w:val="ListParagraph"/>
+        <w:spacing w:beforeLines="80" w:before="192" w:afterLines="80" w:after="192" w:line="264" w:lineRule="auto"/>
+        <w:ind w:left="360"/>
+        <w:rPr>
+          <w:rFonts w:ascii="Times New Roman" w:hAnsi="Times New Roman" w:cs="Times New Roman"/>
+          <w:i/>
+          <w:iCs/>
+          <w:sz w:val="20"/>
+          <w:szCs w:val="20"/>
+        </w:rPr>
+      </w:pPr>
+      <w:r>
+        <w:rPr>
+          <w:rFonts w:ascii="Times New Roman" w:hAnsi="Times New Roman" w:cs="Times New Roman"/>
+          <w:i/>
+          <w:iCs/>
+          <w:sz w:val="20"/>
+          <w:szCs w:val="20"/>
+        </w:rPr>
+        <w:t>Space for text</w:t>
+      </w:r>
+    </w:p>
+    <w:p>
+      <w:pPr>
+        <w:spacing w:beforeLines="80" w:before="192" w:afterLines="80" w:after="192" w:line="264" w:lineRule="auto"/>
+        <w:rPr>
+          <w:rFonts w:ascii="Times New Roman" w:hAnsi="Times New Roman" w:cs="Times New Roman"/>
+          <w:sz w:val="20"/>
+          <w:szCs w:val="20"/>
+        </w:rPr>
+      </w:pPr>
+      <w:r>
+        <w:rPr>
+          <w:rFonts w:ascii="Times New Roman" w:hAnsi="Times New Roman" w:cs="Times New Roman"/>
+          <w:sz w:val="20"/>
+          <w:szCs w:val="20"/>
+        </w:rPr>
+        <w:lastRenderedPageBreak/>
         <w:t>---------------------------------------------------------------------------------------------------------------------------</w:t>
       </w:r>
     </w:p>
     <w:p>
       <w:pPr>
+        <w:spacing w:beforeLines="80" w:before="192" w:afterLines="80" w:after="192" w:line="264" w:lineRule="auto"/>
         <w:rPr>
           <w:rFonts w:ascii="Times New Roman" w:hAnsi="Times New Roman" w:cs="Times New Roman"/>
           <w:sz w:val="20"/>
@@ -1130,6 +896,7 @@
     </w:p>
     <w:p>
       <w:pPr>
+        <w:spacing w:beforeLines="80" w:before="192" w:afterLines="80" w:after="192" w:line="264" w:lineRule="auto"/>
         <w:rPr>
           <w:rFonts w:ascii="Times New Roman" w:hAnsi="Times New Roman" w:cs="Times New Roman"/>
           <w:sz w:val="20"/>
@@ -1162,32 +929,29 @@
         </w:rPr>
         <w:t xml:space="preserve"> members who have gone above and beyond in providing you with exceptional service?</w:t>
       </w:r>
-    </w:p>
-    <w:p>
-      <w:pPr>
+      <w:r>
         <w:rPr>
           <w:rFonts w:ascii="Times New Roman" w:hAnsi="Times New Roman" w:cs="Times New Roman"/>
-          <w:bCs/>
-          <w:i/>
-          <w:iCs/>
           <w:sz w:val="20"/>
           <w:szCs w:val="20"/>
         </w:rPr>
-      </w:pPr>
+        <w:br/>
+      </w:r>
       <w:r>
         <w:rPr>
           <w:rFonts w:ascii="Times New Roman" w:hAnsi="Times New Roman" w:cs="Times New Roman"/>
           <w:bCs/>
           <w:i/>
           <w:iCs/>
-          <w:sz w:val="20"/>
-          <w:szCs w:val="20"/>
+          <w:sz w:val="16"/>
+          <w:szCs w:val="16"/>
         </w:rPr>
         <w:t>Space for text</w:t>
       </w:r>
     </w:p>
     <w:p>
       <w:pPr>
+        <w:spacing w:beforeLines="80" w:before="192" w:afterLines="80" w:after="192" w:line="264" w:lineRule="auto"/>
         <w:rPr>
           <w:rFonts w:ascii="Times New Roman" w:hAnsi="Times New Roman" w:cs="Times New Roman"/>
           <w:b/>
@@ -1196,6 +960,7 @@
         </w:rPr>
       </w:pPr>
     </w:p>
+    <w:p/>
     <w:sectPr>
       <w:pgSz w:w="12240" w:h="15840"/>
       <w:pgMar w:top="1440" w:right="1800" w:bottom="1440" w:left="1800" w:header="720" w:footer="720" w:gutter="0"/>
@@ -2472,6 +2237,7 @@
   <w:style w:type="character" w:default="1" w:styleId="DefaultParagraphFont">
     <w:name w:val="Default Paragraph Font"/>
     <w:uiPriority w:val="1"/>
+    <w:semiHidden/>
     <w:unhideWhenUsed/>
   </w:style>
   <w:style w:type="table" w:default="1" w:styleId="TableNormal">

</xml_diff>